<commit_message>
Doc com registro do PL-SQL
</commit_message>
<xml_diff>
--- a/SUBIDA DO BACKEND (WAR) NO SERVIDOR TOMCAT LOCAL.docx
+++ b/SUBIDA DO BACKEND (WAR) NO SERVIDOR TOMCAT LOCAL.docx
@@ -1609,6 +1609,10 @@
         <w:spacing w:after="0" w:line="240" w:lineRule="auto"/>
       </w:pPr>
       <w:r>
+        <w:rPr>
+          <w:noProof/>
+          <w:lang w:eastAsia="pt-BR"/>
+        </w:rPr>
         <w:drawing>
           <wp:inline distT="0" distB="0" distL="0" distR="0" wp14:anchorId="40016586" wp14:editId="30A47AFD">
             <wp:extent cx="3419952" cy="1105054"/>
@@ -1669,6 +1673,10 @@
         <w:spacing w:after="0" w:line="240" w:lineRule="auto"/>
       </w:pPr>
       <w:r>
+        <w:rPr>
+          <w:noProof/>
+          <w:lang w:eastAsia="pt-BR"/>
+        </w:rPr>
         <w:drawing>
           <wp:inline distT="0" distB="0" distL="0" distR="0" wp14:anchorId="4F6BE47D" wp14:editId="44898FFE">
             <wp:extent cx="4305901" cy="781159"/>
@@ -1716,6 +1724,10 @@
         <w:spacing w:after="0" w:line="240" w:lineRule="auto"/>
       </w:pPr>
       <w:r>
+        <w:rPr>
+          <w:noProof/>
+          <w:lang w:eastAsia="pt-BR"/>
+        </w:rPr>
         <w:drawing>
           <wp:inline distT="0" distB="0" distL="0" distR="0" wp14:anchorId="3BB796E6" wp14:editId="434D9BBD">
             <wp:extent cx="4314825" cy="809625"/>
@@ -1784,6 +1796,10 @@
         <w:spacing w:after="0" w:line="240" w:lineRule="auto"/>
       </w:pPr>
       <w:r>
+        <w:rPr>
+          <w:noProof/>
+          <w:lang w:eastAsia="pt-BR"/>
+        </w:rPr>
         <w:drawing>
           <wp:inline distT="0" distB="0" distL="0" distR="0" wp14:anchorId="04B959BB" wp14:editId="255E9E70">
             <wp:extent cx="5400040" cy="2771775"/>
@@ -1825,13 +1841,21 @@
       <w:pPr>
         <w:spacing w:after="0" w:line="240" w:lineRule="auto"/>
       </w:pPr>
-    </w:p>
-    <w:p>
-      <w:pPr>
-        <w:spacing w:after="0" w:line="240" w:lineRule="auto"/>
-      </w:pPr>
-      <w:r>
-        <w:t xml:space="preserve">Rodar CMD como administrador e ir até a pasta bin do </w:t>
+      <w:r>
+        <w:rPr>
+          <w:b/>
+          <w:color w:val="FF0000"/>
+        </w:rPr>
+        <w:t>OBS:</w:t>
+      </w:r>
+      <w:r>
+        <w:rPr>
+          <w:color w:val="FF0000"/>
+        </w:rPr>
+        <w:t xml:space="preserve"> </w:t>
+      </w:r>
+      <w:r>
+        <w:t xml:space="preserve">É necessário criar o caminho das imagens dentro do Apache </w:t>
       </w:r>
       <w:proofErr w:type="spellStart"/>
       <w:r>
@@ -1839,7 +1863,7 @@
       </w:r>
       <w:proofErr w:type="spellEnd"/>
       <w:r>
-        <w:t xml:space="preserve"> e executar “startup.bat”</w:t>
+        <w:t>. Isso é usado principalmente para a geração dos Relatórios.</w:t>
       </w:r>
     </w:p>
     <w:p>
@@ -1848,10 +1872,10 @@
       </w:pPr>
       <w:r>
         <w:drawing>
-          <wp:inline distT="0" distB="0" distL="0" distR="0" wp14:anchorId="58018A09" wp14:editId="3CDA453B">
-            <wp:extent cx="3620005" cy="400106"/>
+          <wp:inline distT="0" distB="0" distL="0" distR="0" wp14:anchorId="178EE70C" wp14:editId="467380A3">
+            <wp:extent cx="5400040" cy="1071880"/>
             <wp:effectExtent l="0" t="0" r="0" b="0"/>
-            <wp:docPr id="5" name="Imagem 5"/>
+            <wp:docPr id="11" name="Imagem 11"/>
             <wp:cNvGraphicFramePr>
               <a:graphicFrameLocks xmlns:a="http://schemas.openxmlformats.org/drawingml/2006/main" noChangeAspect="1"/>
             </wp:cNvGraphicFramePr>
@@ -1871,7 +1895,7 @@
                   <pic:spPr>
                     <a:xfrm>
                       <a:off x="0" y="0"/>
-                      <a:ext cx="3620005" cy="400106"/>
+                      <a:ext cx="5400040" cy="1071880"/>
                     </a:xfrm>
                     <a:prstGeom prst="rect">
                       <a:avLst/>
@@ -1893,9 +1917,13 @@
       <w:pPr>
         <w:spacing w:after="0" w:line="240" w:lineRule="auto"/>
       </w:pPr>
-      <w:r>
-        <w:t>Apareceu Spring, então está compilando corretamente:</w:t>
-      </w:r>
+      <w:bookmarkStart w:id="0" w:name="_GoBack"/>
+      <w:bookmarkEnd w:id="0"/>
+    </w:p>
+    <w:p>
+      <w:pPr>
+        <w:spacing w:after="0" w:line="240" w:lineRule="auto"/>
+      </w:pPr>
     </w:p>
     <w:p>
       <w:pPr>
@@ -1903,11 +1931,31 @@
       </w:pPr>
       <w:r>
         <w:lastRenderedPageBreak/>
+        <w:t xml:space="preserve">Rodar CMD como administrador e ir até a pasta bin do </w:t>
+      </w:r>
+      <w:proofErr w:type="spellStart"/>
+      <w:r>
+        <w:t>Tomcat</w:t>
+      </w:r>
+      <w:proofErr w:type="spellEnd"/>
+      <w:r>
+        <w:t xml:space="preserve"> e executar “startup.bat”</w:t>
+      </w:r>
+    </w:p>
+    <w:p>
+      <w:pPr>
+        <w:spacing w:after="0" w:line="240" w:lineRule="auto"/>
+      </w:pPr>
+      <w:r>
+        <w:rPr>
+          <w:noProof/>
+          <w:lang w:eastAsia="pt-BR"/>
+        </w:rPr>
         <w:drawing>
-          <wp:inline distT="0" distB="0" distL="0" distR="0" wp14:anchorId="61258735" wp14:editId="28A8FDCB">
-            <wp:extent cx="5400040" cy="1077595"/>
-            <wp:effectExtent l="0" t="0" r="0" b="8255"/>
-            <wp:docPr id="6" name="Imagem 6"/>
+          <wp:inline distT="0" distB="0" distL="0" distR="0" wp14:anchorId="58018A09" wp14:editId="3CDA453B">
+            <wp:extent cx="3620005" cy="400106"/>
+            <wp:effectExtent l="0" t="0" r="0" b="0"/>
+            <wp:docPr id="5" name="Imagem 5"/>
             <wp:cNvGraphicFramePr>
               <a:graphicFrameLocks xmlns:a="http://schemas.openxmlformats.org/drawingml/2006/main" noChangeAspect="1"/>
             </wp:cNvGraphicFramePr>
@@ -1927,7 +1975,7 @@
                   <pic:spPr>
                     <a:xfrm>
                       <a:off x="0" y="0"/>
-                      <a:ext cx="5400040" cy="1077595"/>
+                      <a:ext cx="3620005" cy="400106"/>
                     </a:xfrm>
                     <a:prstGeom prst="rect">
                       <a:avLst/>
@@ -1950,19 +1998,23 @@
         <w:spacing w:after="0" w:line="240" w:lineRule="auto"/>
       </w:pPr>
       <w:r>
-        <w:t>No final tem que dar a mensagem:</w:t>
-      </w:r>
-    </w:p>
-    <w:p>
-      <w:pPr>
-        <w:spacing w:after="0" w:line="240" w:lineRule="auto"/>
-      </w:pPr>
-      <w:r>
+        <w:t>Apareceu Spring, então está compilando corretamente:</w:t>
+      </w:r>
+    </w:p>
+    <w:p>
+      <w:pPr>
+        <w:spacing w:after="0" w:line="240" w:lineRule="auto"/>
+      </w:pPr>
+      <w:r>
+        <w:rPr>
+          <w:noProof/>
+          <w:lang w:eastAsia="pt-BR"/>
+        </w:rPr>
         <w:drawing>
-          <wp:inline distT="0" distB="0" distL="0" distR="0" wp14:anchorId="6D68FD8F" wp14:editId="04EF71E7">
-            <wp:extent cx="5400040" cy="372745"/>
+          <wp:inline distT="0" distB="0" distL="0" distR="0" wp14:anchorId="61258735" wp14:editId="28A8FDCB">
+            <wp:extent cx="5400040" cy="1077595"/>
             <wp:effectExtent l="0" t="0" r="0" b="8255"/>
-            <wp:docPr id="7" name="Imagem 7"/>
+            <wp:docPr id="6" name="Imagem 6"/>
             <wp:cNvGraphicFramePr>
               <a:graphicFrameLocks xmlns:a="http://schemas.openxmlformats.org/drawingml/2006/main" noChangeAspect="1"/>
             </wp:cNvGraphicFramePr>
@@ -1982,7 +2034,7 @@
                   <pic:spPr>
                     <a:xfrm>
                       <a:off x="0" y="0"/>
-                      <a:ext cx="5400040" cy="372745"/>
+                      <a:ext cx="5400040" cy="1077595"/>
                     </a:xfrm>
                     <a:prstGeom prst="rect">
                       <a:avLst/>
@@ -2005,30 +2057,23 @@
         <w:spacing w:after="0" w:line="240" w:lineRule="auto"/>
       </w:pPr>
       <w:r>
-        <w:t>Dentro da opção “</w:t>
-      </w:r>
-      <w:r>
-        <w:t xml:space="preserve">Manager </w:t>
-      </w:r>
-      <w:proofErr w:type="spellStart"/>
-      <w:r>
-        <w:t>App</w:t>
-      </w:r>
-      <w:proofErr w:type="spellEnd"/>
-      <w:r>
-        <w:t>”</w:t>
-      </w:r>
-    </w:p>
-    <w:p>
-      <w:pPr>
-        <w:spacing w:after="0" w:line="240" w:lineRule="auto"/>
-      </w:pPr>
-      <w:r>
+        <w:t>No final tem que dar a mensagem:</w:t>
+      </w:r>
+    </w:p>
+    <w:p>
+      <w:pPr>
+        <w:spacing w:after="0" w:line="240" w:lineRule="auto"/>
+      </w:pPr>
+      <w:r>
+        <w:rPr>
+          <w:noProof/>
+          <w:lang w:eastAsia="pt-BR"/>
+        </w:rPr>
         <w:drawing>
-          <wp:inline distT="0" distB="0" distL="0" distR="0" wp14:anchorId="464AC9D3" wp14:editId="71E3A010">
-            <wp:extent cx="1457528" cy="362001"/>
-            <wp:effectExtent l="0" t="0" r="0" b="0"/>
-            <wp:docPr id="10" name="Imagem 10"/>
+          <wp:inline distT="0" distB="0" distL="0" distR="0" wp14:anchorId="6D68FD8F" wp14:editId="04EF71E7">
+            <wp:extent cx="5400040" cy="372745"/>
+            <wp:effectExtent l="0" t="0" r="0" b="8255"/>
+            <wp:docPr id="7" name="Imagem 7"/>
             <wp:cNvGraphicFramePr>
               <a:graphicFrameLocks xmlns:a="http://schemas.openxmlformats.org/drawingml/2006/main" noChangeAspect="1"/>
             </wp:cNvGraphicFramePr>
@@ -2048,7 +2093,7 @@
                   <pic:spPr>
                     <a:xfrm>
                       <a:off x="0" y="0"/>
-                      <a:ext cx="1457528" cy="362001"/>
+                      <a:ext cx="5400040" cy="372745"/>
                     </a:xfrm>
                     <a:prstGeom prst="rect">
                       <a:avLst/>
@@ -2065,33 +2110,40 @@
       <w:pPr>
         <w:spacing w:after="0" w:line="240" w:lineRule="auto"/>
       </w:pPr>
-      <w:r>
-        <w:t xml:space="preserve">Podemos ver a aplicação do </w:t>
-      </w:r>
-      <w:proofErr w:type="spellStart"/>
-      <w:r>
-        <w:t>war</w:t>
-      </w:r>
-      <w:proofErr w:type="spellEnd"/>
-      <w:r>
-        <w:t xml:space="preserve"> (sgsc-1.0.0</w:t>
-      </w:r>
-      <w:bookmarkStart w:id="0" w:name="_GoBack"/>
-      <w:bookmarkEnd w:id="0"/>
-      <w:r>
-        <w:t>)</w:t>
-      </w:r>
-    </w:p>
-    <w:p>
-      <w:pPr>
-        <w:spacing w:after="0" w:line="240" w:lineRule="auto"/>
-      </w:pPr>
-      <w:r>
+    </w:p>
+    <w:p>
+      <w:pPr>
+        <w:spacing w:after="0" w:line="240" w:lineRule="auto"/>
+      </w:pPr>
+      <w:r>
+        <w:t>Dentro da opção “</w:t>
+      </w:r>
+      <w:r>
+        <w:t xml:space="preserve">Manager </w:t>
+      </w:r>
+      <w:proofErr w:type="spellStart"/>
+      <w:r>
+        <w:t>App</w:t>
+      </w:r>
+      <w:proofErr w:type="spellEnd"/>
+      <w:r>
+        <w:t>”</w:t>
+      </w:r>
+    </w:p>
+    <w:p>
+      <w:pPr>
+        <w:spacing w:after="0" w:line="240" w:lineRule="auto"/>
+      </w:pPr>
+      <w:r>
+        <w:rPr>
+          <w:noProof/>
+          <w:lang w:eastAsia="pt-BR"/>
+        </w:rPr>
         <w:drawing>
-          <wp:inline distT="0" distB="0" distL="0" distR="0" wp14:anchorId="69455916" wp14:editId="5D523585">
-            <wp:extent cx="5562600" cy="428625"/>
-            <wp:effectExtent l="0" t="0" r="0" b="9525"/>
-            <wp:docPr id="9" name="Imagem 9"/>
+          <wp:inline distT="0" distB="0" distL="0" distR="0" wp14:anchorId="464AC9D3" wp14:editId="71E3A010">
+            <wp:extent cx="1457528" cy="362001"/>
+            <wp:effectExtent l="0" t="0" r="0" b="0"/>
+            <wp:docPr id="10" name="Imagem 10"/>
             <wp:cNvGraphicFramePr>
               <a:graphicFrameLocks xmlns:a="http://schemas.openxmlformats.org/drawingml/2006/main" noChangeAspect="1"/>
             </wp:cNvGraphicFramePr>
@@ -2111,6 +2163,68 @@
                   <pic:spPr>
                     <a:xfrm>
                       <a:off x="0" y="0"/>
+                      <a:ext cx="1457528" cy="362001"/>
+                    </a:xfrm>
+                    <a:prstGeom prst="rect">
+                      <a:avLst/>
+                    </a:prstGeom>
+                  </pic:spPr>
+                </pic:pic>
+              </a:graphicData>
+            </a:graphic>
+          </wp:inline>
+        </w:drawing>
+      </w:r>
+    </w:p>
+    <w:p>
+      <w:pPr>
+        <w:spacing w:after="0" w:line="240" w:lineRule="auto"/>
+      </w:pPr>
+      <w:r>
+        <w:t xml:space="preserve">Podemos ver a aplicação do </w:t>
+      </w:r>
+      <w:proofErr w:type="spellStart"/>
+      <w:r>
+        <w:t>war</w:t>
+      </w:r>
+      <w:proofErr w:type="spellEnd"/>
+      <w:r>
+        <w:t xml:space="preserve"> (sgsc-1.0.0)</w:t>
+      </w:r>
+    </w:p>
+    <w:p>
+      <w:pPr>
+        <w:spacing w:after="0" w:line="240" w:lineRule="auto"/>
+      </w:pPr>
+      <w:r>
+        <w:rPr>
+          <w:noProof/>
+          <w:lang w:eastAsia="pt-BR"/>
+        </w:rPr>
+        <w:drawing>
+          <wp:inline distT="0" distB="0" distL="0" distR="0" wp14:anchorId="69455916" wp14:editId="5D523585">
+            <wp:extent cx="5562600" cy="428625"/>
+            <wp:effectExtent l="0" t="0" r="0" b="9525"/>
+            <wp:docPr id="9" name="Imagem 9"/>
+            <wp:cNvGraphicFramePr>
+              <a:graphicFrameLocks xmlns:a="http://schemas.openxmlformats.org/drawingml/2006/main" noChangeAspect="1"/>
+            </wp:cNvGraphicFramePr>
+            <a:graphic xmlns:a="http://schemas.openxmlformats.org/drawingml/2006/main">
+              <a:graphicData uri="http://schemas.openxmlformats.org/drawingml/2006/picture">
+                <pic:pic xmlns:pic="http://schemas.openxmlformats.org/drawingml/2006/picture">
+                  <pic:nvPicPr>
+                    <pic:cNvPr id="1" name=""/>
+                    <pic:cNvPicPr/>
+                  </pic:nvPicPr>
+                  <pic:blipFill>
+                    <a:blip r:embed="rId14"/>
+                    <a:stretch>
+                      <a:fillRect/>
+                    </a:stretch>
+                  </pic:blipFill>
+                  <pic:spPr>
+                    <a:xfrm>
+                      <a:off x="0" y="0"/>
                       <a:ext cx="5562600" cy="428625"/>
                     </a:xfrm>
                     <a:prstGeom prst="rect">
@@ -2150,6 +2264,10 @@
         <w:spacing w:after="0" w:line="240" w:lineRule="auto"/>
       </w:pPr>
       <w:r>
+        <w:rPr>
+          <w:noProof/>
+          <w:lang w:eastAsia="pt-BR"/>
+        </w:rPr>
         <w:drawing>
           <wp:inline distT="0" distB="0" distL="0" distR="0" wp14:anchorId="7BD31952" wp14:editId="2B11AC85">
             <wp:extent cx="5400040" cy="1058545"/>
@@ -2166,7 +2284,7 @@
                     <pic:cNvPicPr/>
                   </pic:nvPicPr>
                   <pic:blipFill>
-                    <a:blip r:embed="rId14"/>
+                    <a:blip r:embed="rId15"/>
                     <a:stretch>
                       <a:fillRect/>
                     </a:stretch>

</xml_diff>